<commit_message>
Logok elkészítése hogy megjelenjen/ SQL frissítése/Word doc
</commit_message>
<xml_diff>
--- a/doc/Munkafolyamat.docx
+++ b/doc/Munkafolyamat.docx
@@ -508,16 +508,193 @@
           <w:sz w:val="28"/>
           <w:szCs w:val="28"/>
         </w:rPr>
-        <w:t xml:space="preserve"> létrehozása</w:t>
-      </w:r>
-      <w:bookmarkStart w:id="0" w:name="_GoBack"/>
-      <w:bookmarkEnd w:id="0"/>
-      <w:r>
-        <w:rPr>
-          <w:sz w:val="28"/>
-          <w:szCs w:val="28"/>
-        </w:rPr>
-        <w:t>Magyar kupa</w:t>
+        <w:t xml:space="preserve"> </w:t>
+      </w:r>
+      <w:proofErr w:type="spellStart"/>
+      <w:r>
+        <w:rPr>
+          <w:sz w:val="28"/>
+          <w:szCs w:val="28"/>
+        </w:rPr>
+        <w:t>létrehozása</w:t>
+      </w:r>
+      <w:r>
+        <w:rPr>
+          <w:sz w:val="28"/>
+          <w:szCs w:val="28"/>
+        </w:rPr>
+        <w:t>Magyar</w:t>
+      </w:r>
+      <w:proofErr w:type="spellEnd"/>
+      <w:r>
+        <w:rPr>
+          <w:sz w:val="28"/>
+          <w:szCs w:val="28"/>
+        </w:rPr>
+        <w:t xml:space="preserve"> kupa</w:t>
+      </w:r>
+    </w:p>
+    <w:p>
+      <w:pPr>
+        <w:pStyle w:val="Listaszerbekezds"/>
+        <w:numPr>
+          <w:ilvl w:val="4"/>
+          <w:numId w:val="6"/>
+        </w:numPr>
+        <w:rPr>
+          <w:sz w:val="28"/>
+          <w:szCs w:val="28"/>
+        </w:rPr>
+      </w:pPr>
+      <w:proofErr w:type="spellStart"/>
+      <w:r>
+        <w:rPr>
+          <w:sz w:val="28"/>
+          <w:szCs w:val="28"/>
+        </w:rPr>
+        <w:t>Eredmenyek</w:t>
+      </w:r>
+      <w:proofErr w:type="spellEnd"/>
+      <w:r>
+        <w:rPr>
+          <w:sz w:val="28"/>
+          <w:szCs w:val="28"/>
+        </w:rPr>
+        <w:t xml:space="preserve"> elkészítése</w:t>
+      </w:r>
+    </w:p>
+    <w:p>
+      <w:pPr>
+        <w:pStyle w:val="Listaszerbekezds"/>
+        <w:numPr>
+          <w:ilvl w:val="4"/>
+          <w:numId w:val="6"/>
+        </w:numPr>
+        <w:rPr>
+          <w:sz w:val="28"/>
+          <w:szCs w:val="28"/>
+        </w:rPr>
+      </w:pPr>
+      <w:proofErr w:type="spellStart"/>
+      <w:r>
+        <w:rPr>
+          <w:sz w:val="28"/>
+          <w:szCs w:val="28"/>
+        </w:rPr>
+        <w:t>Lineup</w:t>
+      </w:r>
+      <w:proofErr w:type="spellEnd"/>
+      <w:r>
+        <w:rPr>
+          <w:sz w:val="28"/>
+          <w:szCs w:val="28"/>
+        </w:rPr>
+        <w:t xml:space="preserve"> elkészítése</w:t>
+      </w:r>
+    </w:p>
+    <w:p>
+      <w:pPr>
+        <w:pStyle w:val="Listaszerbekezds"/>
+        <w:numPr>
+          <w:ilvl w:val="4"/>
+          <w:numId w:val="6"/>
+        </w:numPr>
+        <w:rPr>
+          <w:sz w:val="28"/>
+          <w:szCs w:val="28"/>
+        </w:rPr>
+      </w:pPr>
+      <w:r>
+        <w:rPr>
+          <w:sz w:val="28"/>
+          <w:szCs w:val="28"/>
+        </w:rPr>
+        <w:t>News munkálatok</w:t>
+      </w:r>
+    </w:p>
+    <w:p>
+      <w:pPr>
+        <w:pStyle w:val="Listaszerbekezds"/>
+        <w:numPr>
+          <w:ilvl w:val="4"/>
+          <w:numId w:val="6"/>
+        </w:numPr>
+        <w:rPr>
+          <w:sz w:val="28"/>
+          <w:szCs w:val="28"/>
+        </w:rPr>
+      </w:pPr>
+      <w:r>
+        <w:rPr>
+          <w:sz w:val="28"/>
+          <w:szCs w:val="28"/>
+        </w:rPr>
+        <w:t>Főoldal tabellák elkészítése</w:t>
+      </w:r>
+    </w:p>
+    <w:p>
+      <w:pPr>
+        <w:pStyle w:val="Listaszerbekezds"/>
+        <w:numPr>
+          <w:ilvl w:val="4"/>
+          <w:numId w:val="6"/>
+        </w:numPr>
+        <w:rPr>
+          <w:sz w:val="28"/>
+          <w:szCs w:val="28"/>
+        </w:rPr>
+      </w:pPr>
+      <w:r>
+        <w:rPr>
+          <w:sz w:val="28"/>
+          <w:szCs w:val="28"/>
+        </w:rPr>
+        <w:t>php-k elkészítése</w:t>
+      </w:r>
+    </w:p>
+    <w:p>
+      <w:pPr>
+        <w:pStyle w:val="Listaszerbekezds"/>
+        <w:numPr>
+          <w:ilvl w:val="4"/>
+          <w:numId w:val="6"/>
+        </w:numPr>
+        <w:rPr>
+          <w:sz w:val="28"/>
+          <w:szCs w:val="28"/>
+        </w:rPr>
+      </w:pPr>
+      <w:proofErr w:type="spellStart"/>
+      <w:r>
+        <w:rPr>
+          <w:sz w:val="28"/>
+          <w:szCs w:val="28"/>
+        </w:rPr>
+        <w:t>angular</w:t>
+      </w:r>
+      <w:proofErr w:type="spellEnd"/>
+      <w:r>
+        <w:rPr>
+          <w:sz w:val="28"/>
+          <w:szCs w:val="28"/>
+        </w:rPr>
+        <w:t xml:space="preserve"> </w:t>
+      </w:r>
+      <w:proofErr w:type="spellStart"/>
+      <w:r>
+        <w:rPr>
+          <w:sz w:val="28"/>
+          <w:szCs w:val="28"/>
+        </w:rPr>
+        <w:t>controllerek</w:t>
+      </w:r>
+      <w:proofErr w:type="spellEnd"/>
+      <w:r>
+        <w:rPr>
+          <w:sz w:val="28"/>
+          <w:szCs w:val="28"/>
+        </w:rPr>
+        <w:t xml:space="preserve"> elkészítése</w:t>
       </w:r>
     </w:p>
     <w:p>
@@ -647,6 +824,163 @@
         </w:rPr>
         <w:t xml:space="preserve"> elkészítése</w:t>
       </w:r>
+    </w:p>
+    <w:p>
+      <w:pPr>
+        <w:pStyle w:val="Listaszerbekezds"/>
+        <w:numPr>
+          <w:ilvl w:val="0"/>
+          <w:numId w:val="7"/>
+        </w:numPr>
+        <w:rPr>
+          <w:sz w:val="40"/>
+          <w:szCs w:val="40"/>
+        </w:rPr>
+      </w:pPr>
+      <w:r>
+        <w:rPr>
+          <w:sz w:val="32"/>
+          <w:szCs w:val="32"/>
+        </w:rPr>
+        <w:t xml:space="preserve">Oldal dizájn </w:t>
+      </w:r>
+      <w:proofErr w:type="spellStart"/>
+      <w:r>
+        <w:rPr>
+          <w:sz w:val="32"/>
+          <w:szCs w:val="32"/>
+        </w:rPr>
+        <w:t>at</w:t>
+      </w:r>
+      <w:proofErr w:type="spellEnd"/>
+      <w:r>
+        <w:rPr>
+          <w:sz w:val="32"/>
+          <w:szCs w:val="32"/>
+        </w:rPr>
+        <w:t xml:space="preserve"> alakítása a tábláknál</w:t>
+      </w:r>
+    </w:p>
+    <w:p>
+      <w:pPr>
+        <w:pStyle w:val="Listaszerbekezds"/>
+        <w:numPr>
+          <w:ilvl w:val="0"/>
+          <w:numId w:val="7"/>
+        </w:numPr>
+        <w:rPr>
+          <w:sz w:val="32"/>
+          <w:szCs w:val="32"/>
+        </w:rPr>
+      </w:pPr>
+      <w:proofErr w:type="spellStart"/>
+      <w:r>
+        <w:rPr>
+          <w:sz w:val="32"/>
+          <w:szCs w:val="32"/>
+        </w:rPr>
+        <w:t>news</w:t>
+      </w:r>
+      <w:proofErr w:type="spellEnd"/>
+      <w:r>
+        <w:rPr>
+          <w:sz w:val="32"/>
+          <w:szCs w:val="32"/>
+        </w:rPr>
+        <w:t xml:space="preserve"> munkálatok</w:t>
+      </w:r>
+    </w:p>
+    <w:p>
+      <w:pPr>
+        <w:pStyle w:val="Listaszerbekezds"/>
+        <w:numPr>
+          <w:ilvl w:val="0"/>
+          <w:numId w:val="7"/>
+        </w:numPr>
+        <w:rPr>
+          <w:sz w:val="32"/>
+          <w:szCs w:val="32"/>
+        </w:rPr>
+      </w:pPr>
+      <w:proofErr w:type="spellStart"/>
+      <w:r>
+        <w:rPr>
+          <w:sz w:val="32"/>
+          <w:szCs w:val="32"/>
+        </w:rPr>
+        <w:t>Rolunk</w:t>
+      </w:r>
+      <w:proofErr w:type="spellEnd"/>
+      <w:r>
+        <w:rPr>
+          <w:sz w:val="32"/>
+          <w:szCs w:val="32"/>
+        </w:rPr>
+        <w:t xml:space="preserve"> </w:t>
+      </w:r>
+      <w:proofErr w:type="spellStart"/>
+      <w:r>
+        <w:rPr>
+          <w:sz w:val="32"/>
+          <w:szCs w:val="32"/>
+        </w:rPr>
+        <w:t>elkészitése</w:t>
+      </w:r>
+      <w:proofErr w:type="spellEnd"/>
+      <w:r>
+        <w:rPr>
+          <w:sz w:val="32"/>
+          <w:szCs w:val="32"/>
+        </w:rPr>
+        <w:t xml:space="preserve"> </w:t>
+      </w:r>
+    </w:p>
+    <w:p>
+      <w:pPr>
+        <w:pStyle w:val="Listaszerbekezds"/>
+        <w:numPr>
+          <w:ilvl w:val="0"/>
+          <w:numId w:val="7"/>
+        </w:numPr>
+        <w:rPr>
+          <w:sz w:val="32"/>
+          <w:szCs w:val="32"/>
+        </w:rPr>
+      </w:pPr>
+      <w:proofErr w:type="spellStart"/>
+      <w:r>
+        <w:rPr>
+          <w:sz w:val="32"/>
+          <w:szCs w:val="32"/>
+        </w:rPr>
+        <w:t>Rolunk</w:t>
+      </w:r>
+      <w:proofErr w:type="spellEnd"/>
+      <w:r>
+        <w:rPr>
+          <w:sz w:val="32"/>
+          <w:szCs w:val="32"/>
+        </w:rPr>
+        <w:t xml:space="preserve"> </w:t>
+      </w:r>
+      <w:proofErr w:type="spellStart"/>
+      <w:r>
+        <w:rPr>
+          <w:sz w:val="32"/>
+          <w:szCs w:val="32"/>
+        </w:rPr>
+        <w:t>controller</w:t>
+      </w:r>
+      <w:proofErr w:type="spellEnd"/>
+      <w:r>
+        <w:rPr>
+          <w:sz w:val="32"/>
+          <w:szCs w:val="32"/>
+        </w:rPr>
+        <w:t xml:space="preserve"> elkészítése</w:t>
+      </w:r>
+      <w:bookmarkStart w:id="0" w:name="_GoBack"/>
+      <w:bookmarkEnd w:id="0"/>
     </w:p>
     <w:p>
       <w:pPr>

</xml_diff>